<commit_message>
work on write up
</commit_message>
<xml_diff>
--- a/Academic Report - Thomas JEBSON - 24804704.docx
+++ b/Academic Report - Thomas JEBSON - 24804704.docx
@@ -33,7 +33,21 @@
     </w:p>
     <w:p>
       <w:r>
-        <w:t>Pass</w:t>
+        <w:t xml:space="preserve">The game Bouncing Balls is a copy of an older game called “Puzzle Bobble,” which was produced by the Japanese video game manufacturer Taito in </w:t>
+      </w:r>
+      <w:commentRangeStart w:id="0"/>
+      <w:r>
+        <w:t>1994</w:t>
+      </w:r>
+      <w:commentRangeEnd w:id="0"/>
+      <w:r>
+        <w:rPr>
+          <w:rStyle w:val="CommentReference"/>
+        </w:rPr>
+        <w:commentReference w:id="0"/>
+      </w:r>
+      <w:r>
+        <w:t>. The objective of this game is to arrange balls of the same colour into groups of at least three, as this causes the whole arrangement to pop. Any unsupported balls fall to the bottom of the screen and are also destroyed. The aim of the game is to pop all of the balls in the scene before they reach the bottom of the screen. This downward motion starts as soon as the level begins.</w:t>
       </w:r>
     </w:p>
     <w:p>
@@ -46,7 +60,45 @@
     </w:p>
     <w:p>
       <w:r>
-        <w:t>Pass</w:t>
+        <w:t xml:space="preserve">In this game, you control a cannon which is angled towards your mouse cursor. When you press the </w:t>
+      </w:r>
+      <w:r>
+        <w:t>left mouse button,</w:t>
+      </w:r>
+      <w:r>
+        <w:t xml:space="preserve"> it causes the cannon to fire the ball currently loaded. You can see what </w:t>
+      </w:r>
+      <w:r>
+        <w:t>colour the ball is that you're about to fire, and you can also see the colour</w:t>
+      </w:r>
+      <w:r>
+        <w:t xml:space="preserve"> of the next ball in the queue to fire. Balls are added to this queue at random. When the ball is fired, it moves in the direction the cannon was pointing with uniform velocity but will bounce off the side walls of the game scene.</w:t>
+      </w:r>
+    </w:p>
+    <w:p>
+      <w:r>
+        <w:t xml:space="preserve">If the ball collides with the top of the scene, it will stick to it and </w:t>
+      </w:r>
+      <w:r>
+        <w:t>won't</w:t>
+      </w:r>
+      <w:r>
+        <w:t xml:space="preserve"> bounce off. This sticking behaviour is also observed for any ball-to-ball collision.</w:t>
+      </w:r>
+    </w:p>
+    <w:p/>
+    <w:p>
+      <w:r>
+        <w:t xml:space="preserve">Once the balls have been stuck together, </w:t>
+      </w:r>
+      <w:r>
+        <w:t>the game checks for a grouping of 3 or more balls and pops groups if this condition is met. It is important to note that this condition isn’t checked when the balls are initially placed in the scene.</w:t>
+      </w:r>
+    </w:p>
+    <w:p/>
+    <w:p>
+      <w:r>
+        <w:t>From the moment the level begins, the ceiling begins to move down towards the bottom of the level with uniform velocity. However, should any of the balls trapped beneath the ceiling reach the bottom of the game scene first, the game is over, and the player has lost. The aim of the game is to pop all the balls in the scene before this occurs.</w:t>
       </w:r>
     </w:p>
     <w:p>
@@ -135,6 +187,53 @@
     </w:sectPr>
   </w:body>
 </w:document>
+</file>
+
+<file path=word/comments.xml><?xml version="1.0" encoding="utf-8"?>
+<w:comments xmlns:wpc="http://schemas.microsoft.com/office/word/2010/wordprocessingCanvas" xmlns:cx="http://schemas.microsoft.com/office/drawing/2014/chartex" xmlns:cx1="http://schemas.microsoft.com/office/drawing/2015/9/8/chartex" xmlns:cx2="http://schemas.microsoft.com/office/drawing/2015/10/21/chartex" xmlns:cx3="http://schemas.microsoft.com/office/drawing/2016/5/9/chartex" xmlns:cx4="http://schemas.microsoft.com/office/drawing/2016/5/10/chartex" xmlns:cx5="http://schemas.microsoft.com/office/drawing/2016/5/11/chartex" xmlns:cx6="http://schemas.microsoft.com/office/drawing/2016/5/12/chartex" xmlns:cx7="http://schemas.microsoft.com/office/drawing/2016/5/13/chartex" xmlns:cx8="http://schemas.microsoft.com/office/drawing/2016/5/14/chartex" xmlns:mc="http://schemas.openxmlformats.org/markup-compatibility/2006" xmlns:aink="http://schemas.microsoft.com/office/drawing/2016/ink" xmlns:am3d="http://schemas.microsoft.com/office/drawing/2017/model3d" xmlns:o="urn:schemas-microsoft-com:office:office" xmlns:oel="http://schemas.microsoft.com/office/2019/extlst" xmlns:r="http://schemas.openxmlformats.org/officeDocument/2006/relationships" xmlns:m="http://schemas.openxmlformats.org/officeDocument/2006/math" xmlns:v="urn:schemas-microsoft-com:vml" xmlns:wp14="http://schemas.microsoft.com/office/word/2010/wordprocessingDrawing" xmlns:wp="http://schemas.openxmlformats.org/drawingml/2006/wordprocessingDrawing" xmlns:w10="urn:schemas-microsoft-com:office:word" xmlns:w="http://schemas.openxmlformats.org/wordprocessingml/2006/main" xmlns:w14="http://schemas.microsoft.com/office/word/2010/wordml" xmlns:w15="http://schemas.microsoft.com/office/word/2012/wordml" xmlns:w16cex="http://schemas.microsoft.com/office/word/2018/wordml/cex" xmlns:w16cid="http://schemas.microsoft.com/office/word/2016/wordml/cid" xmlns:w16="http://schemas.microsoft.com/office/word/2018/wordml" xmlns:w16du="http://schemas.microsoft.com/office/word/2023/wordml/word16du" xmlns:w16sdtdh="http://schemas.microsoft.com/office/word/2020/wordml/sdtdatahash" xmlns:w16se="http://schemas.microsoft.com/office/word/2015/wordml/symex" xmlns:wpg="http://schemas.microsoft.com/office/word/2010/wordprocessingGroup" xmlns:wpi="http://schemas.microsoft.com/office/word/2010/wordprocessingInk" xmlns:wne="http://schemas.microsoft.com/office/word/2006/wordml" xmlns:wps="http://schemas.microsoft.com/office/word/2010/wordprocessingShape" mc:Ignorable="w14 w15 w16se w16cid w16 w16cex w16sdtdh w16du wp14">
+  <w:comment w:id="0" w:author="Pamela Jebson" w:date="2024-10-30T12:24:00Z" w:initials="PJ">
+    <w:p>
+      <w:pPr>
+        <w:pStyle w:val="CommentText"/>
+      </w:pPr>
+      <w:r>
+        <w:rPr>
+          <w:rStyle w:val="CommentReference"/>
+        </w:rPr>
+        <w:annotationRef/>
+      </w:r>
+      <w:r>
+        <w:t>https://www.arcade-museum.com/Videogame/puzzle-bobble - 12/10/2024 - 20:45</w:t>
+      </w:r>
+    </w:p>
+  </w:comment>
+</w:comments>
+</file>
+
+<file path=word/commentsExtended.xml><?xml version="1.0" encoding="utf-8"?>
+<w15:commentsEx xmlns:wpc="http://schemas.microsoft.com/office/word/2010/wordprocessingCanvas" xmlns:cx="http://schemas.microsoft.com/office/drawing/2014/chartex" xmlns:cx1="http://schemas.microsoft.com/office/drawing/2015/9/8/chartex" xmlns:cx2="http://schemas.microsoft.com/office/drawing/2015/10/21/chartex" xmlns:cx3="http://schemas.microsoft.com/office/drawing/2016/5/9/chartex" xmlns:cx4="http://schemas.microsoft.com/office/drawing/2016/5/10/chartex" xmlns:cx5="http://schemas.microsoft.com/office/drawing/2016/5/11/chartex" xmlns:cx6="http://schemas.microsoft.com/office/drawing/2016/5/12/chartex" xmlns:cx7="http://schemas.microsoft.com/office/drawing/2016/5/13/chartex" xmlns:cx8="http://schemas.microsoft.com/office/drawing/2016/5/14/chartex" xmlns:mc="http://schemas.openxmlformats.org/markup-compatibility/2006" xmlns:aink="http://schemas.microsoft.com/office/drawing/2016/ink" xmlns:am3d="http://schemas.microsoft.com/office/drawing/2017/model3d" xmlns:o="urn:schemas-microsoft-com:office:office" xmlns:oel="http://schemas.microsoft.com/office/2019/extlst" xmlns:r="http://schemas.openxmlformats.org/officeDocument/2006/relationships" xmlns:m="http://schemas.openxmlformats.org/officeDocument/2006/math" xmlns:v="urn:schemas-microsoft-com:vml" xmlns:wp14="http://schemas.microsoft.com/office/word/2010/wordprocessingDrawing" xmlns:wp="http://schemas.openxmlformats.org/drawingml/2006/wordprocessingDrawing" xmlns:w10="urn:schemas-microsoft-com:office:word" xmlns:w="http://schemas.openxmlformats.org/wordprocessingml/2006/main" xmlns:w14="http://schemas.microsoft.com/office/word/2010/wordml" xmlns:w15="http://schemas.microsoft.com/office/word/2012/wordml" xmlns:w16cex="http://schemas.microsoft.com/office/word/2018/wordml/cex" xmlns:w16cid="http://schemas.microsoft.com/office/word/2016/wordml/cid" xmlns:w16="http://schemas.microsoft.com/office/word/2018/wordml" xmlns:w16du="http://schemas.microsoft.com/office/word/2023/wordml/word16du" xmlns:w16sdtdh="http://schemas.microsoft.com/office/word/2020/wordml/sdtdatahash" xmlns:w16se="http://schemas.microsoft.com/office/word/2015/wordml/symex" xmlns:wpg="http://schemas.microsoft.com/office/word/2010/wordprocessingGroup" xmlns:wpi="http://schemas.microsoft.com/office/word/2010/wordprocessingInk" xmlns:wne="http://schemas.microsoft.com/office/word/2006/wordml" xmlns:wps="http://schemas.microsoft.com/office/word/2010/wordprocessingShape" mc:Ignorable="w14 w15 w16se w16cid w16 w16cex w16sdtdh w16du wp14">
+  <w15:commentEx w15:paraId="2011D196" w15:done="0"/>
+</w15:commentsEx>
+</file>
+
+<file path=word/commentsExtensible.xml><?xml version="1.0" encoding="utf-8"?>
+<w16cex:commentsExtensible xmlns:wpc="http://schemas.microsoft.com/office/word/2010/wordprocessingCanvas" xmlns:cx="http://schemas.microsoft.com/office/drawing/2014/chartex" xmlns:cx1="http://schemas.microsoft.com/office/drawing/2015/9/8/chartex" xmlns:cx2="http://schemas.microsoft.com/office/drawing/2015/10/21/chartex" xmlns:cx3="http://schemas.microsoft.com/office/drawing/2016/5/9/chartex" xmlns:cx4="http://schemas.microsoft.com/office/drawing/2016/5/10/chartex" xmlns:cx5="http://schemas.microsoft.com/office/drawing/2016/5/11/chartex" xmlns:cx6="http://schemas.microsoft.com/office/drawing/2016/5/12/chartex" xmlns:cx7="http://schemas.microsoft.com/office/drawing/2016/5/13/chartex" xmlns:cx8="http://schemas.microsoft.com/office/drawing/2016/5/14/chartex" xmlns:cr="http://schemas.microsoft.com/office/comments/2020/reactions" xmlns:mc="http://schemas.openxmlformats.org/markup-compatibility/2006" xmlns:aink="http://schemas.microsoft.com/office/drawing/2016/ink" xmlns:am3d="http://schemas.microsoft.com/office/drawing/2017/model3d" xmlns:o="urn:schemas-microsoft-com:office:office" xmlns:oel="http://schemas.microsoft.com/office/2019/extlst" xmlns:r="http://schemas.openxmlformats.org/officeDocument/2006/relationships" xmlns:m="http://schemas.openxmlformats.org/officeDocument/2006/math" xmlns:v="urn:schemas-microsoft-com:vml" xmlns:wp14="http://schemas.microsoft.com/office/word/2010/wordprocessingDrawing" xmlns:wp="http://schemas.openxmlformats.org/drawingml/2006/wordprocessingDrawing" xmlns:w10="urn:schemas-microsoft-com:office:word" xmlns:w="http://schemas.openxmlformats.org/wordprocessingml/2006/main" xmlns:w14="http://schemas.microsoft.com/office/word/2010/wordml" xmlns:w15="http://schemas.microsoft.com/office/word/2012/wordml" xmlns:w16cex="http://schemas.microsoft.com/office/word/2018/wordml/cex" xmlns:w16cid="http://schemas.microsoft.com/office/word/2016/wordml/cid" xmlns:w16="http://schemas.microsoft.com/office/word/2018/wordml" xmlns:w16du="http://schemas.microsoft.com/office/word/2023/wordml/word16du" xmlns:w16sdtdh="http://schemas.microsoft.com/office/word/2020/wordml/sdtdatahash" xmlns:w16se="http://schemas.microsoft.com/office/word/2015/wordml/symex" xmlns:wpg="http://schemas.microsoft.com/office/word/2010/wordprocessingGroup" xmlns:wpi="http://schemas.microsoft.com/office/word/2010/wordprocessingInk" xmlns:wne="http://schemas.microsoft.com/office/word/2006/wordml" xmlns:wps="http://schemas.microsoft.com/office/word/2010/wordprocessingShape" mc:Ignorable="w14 w15 w16se w16cid w16 w16cex w16sdtdh cr w16du wp14">
+  <w16cex:commentExtensible w16cex:durableId="2DE6BA9F" w16cex:dateUtc="2024-10-30T12:24:00Z"/>
+</w16cex:commentsExtensible>
+</file>
+
+<file path=word/commentsIds.xml><?xml version="1.0" encoding="utf-8"?>
+<w16cid:commentsIds xmlns:wpc="http://schemas.microsoft.com/office/word/2010/wordprocessingCanvas" xmlns:cx="http://schemas.microsoft.com/office/drawing/2014/chartex" xmlns:cx1="http://schemas.microsoft.com/office/drawing/2015/9/8/chartex" xmlns:cx2="http://schemas.microsoft.com/office/drawing/2015/10/21/chartex" xmlns:cx3="http://schemas.microsoft.com/office/drawing/2016/5/9/chartex" xmlns:cx4="http://schemas.microsoft.com/office/drawing/2016/5/10/chartex" xmlns:cx5="http://schemas.microsoft.com/office/drawing/2016/5/11/chartex" xmlns:cx6="http://schemas.microsoft.com/office/drawing/2016/5/12/chartex" xmlns:cx7="http://schemas.microsoft.com/office/drawing/2016/5/13/chartex" xmlns:cx8="http://schemas.microsoft.com/office/drawing/2016/5/14/chartex" xmlns:mc="http://schemas.openxmlformats.org/markup-compatibility/2006" xmlns:aink="http://schemas.microsoft.com/office/drawing/2016/ink" xmlns:am3d="http://schemas.microsoft.com/office/drawing/2017/model3d" xmlns:o="urn:schemas-microsoft-com:office:office" xmlns:oel="http://schemas.microsoft.com/office/2019/extlst" xmlns:r="http://schemas.openxmlformats.org/officeDocument/2006/relationships" xmlns:m="http://schemas.openxmlformats.org/officeDocument/2006/math" xmlns:v="urn:schemas-microsoft-com:vml" xmlns:wp14="http://schemas.microsoft.com/office/word/2010/wordprocessingDrawing" xmlns:wp="http://schemas.openxmlformats.org/drawingml/2006/wordprocessingDrawing" xmlns:w10="urn:schemas-microsoft-com:office:word" xmlns:w="http://schemas.openxmlformats.org/wordprocessingml/2006/main" xmlns:w14="http://schemas.microsoft.com/office/word/2010/wordml" xmlns:w15="http://schemas.microsoft.com/office/word/2012/wordml" xmlns:w16cex="http://schemas.microsoft.com/office/word/2018/wordml/cex" xmlns:w16cid="http://schemas.microsoft.com/office/word/2016/wordml/cid" xmlns:w16="http://schemas.microsoft.com/office/word/2018/wordml" xmlns:w16du="http://schemas.microsoft.com/office/word/2023/wordml/word16du" xmlns:w16sdtdh="http://schemas.microsoft.com/office/word/2020/wordml/sdtdatahash" xmlns:w16se="http://schemas.microsoft.com/office/word/2015/wordml/symex" xmlns:wpg="http://schemas.microsoft.com/office/word/2010/wordprocessingGroup" xmlns:wpi="http://schemas.microsoft.com/office/word/2010/wordprocessingInk" xmlns:wne="http://schemas.microsoft.com/office/word/2006/wordml" xmlns:wps="http://schemas.microsoft.com/office/word/2010/wordprocessingShape" mc:Ignorable="w14 w15 w16se w16cid w16 w16cex w16sdtdh w16du wp14">
+  <w16cid:commentId w16cid:paraId="2011D196" w16cid:durableId="2DE6BA9F"/>
+</w16cid:commentsIds>
+</file>
+
+<file path=word/people.xml><?xml version="1.0" encoding="utf-8"?>
+<w15:people xmlns:wpc="http://schemas.microsoft.com/office/word/2010/wordprocessingCanvas" xmlns:cx="http://schemas.microsoft.com/office/drawing/2014/chartex" xmlns:cx1="http://schemas.microsoft.com/office/drawing/2015/9/8/chartex" xmlns:cx2="http://schemas.microsoft.com/office/drawing/2015/10/21/chartex" xmlns:cx3="http://schemas.microsoft.com/office/drawing/2016/5/9/chartex" xmlns:cx4="http://schemas.microsoft.com/office/drawing/2016/5/10/chartex" xmlns:cx5="http://schemas.microsoft.com/office/drawing/2016/5/11/chartex" xmlns:cx6="http://schemas.microsoft.com/office/drawing/2016/5/12/chartex" xmlns:cx7="http://schemas.microsoft.com/office/drawing/2016/5/13/chartex" xmlns:cx8="http://schemas.microsoft.com/office/drawing/2016/5/14/chartex" xmlns:mc="http://schemas.openxmlformats.org/markup-compatibility/2006" xmlns:aink="http://schemas.microsoft.com/office/drawing/2016/ink" xmlns:am3d="http://schemas.microsoft.com/office/drawing/2017/model3d" xmlns:o="urn:schemas-microsoft-com:office:office" xmlns:oel="http://schemas.microsoft.com/office/2019/extlst" xmlns:r="http://schemas.openxmlformats.org/officeDocument/2006/relationships" xmlns:m="http://schemas.openxmlformats.org/officeDocument/2006/math" xmlns:v="urn:schemas-microsoft-com:vml" xmlns:wp14="http://schemas.microsoft.com/office/word/2010/wordprocessingDrawing" xmlns:wp="http://schemas.openxmlformats.org/drawingml/2006/wordprocessingDrawing" xmlns:w10="urn:schemas-microsoft-com:office:word" xmlns:w="http://schemas.openxmlformats.org/wordprocessingml/2006/main" xmlns:w14="http://schemas.microsoft.com/office/word/2010/wordml" xmlns:w15="http://schemas.microsoft.com/office/word/2012/wordml" xmlns:w16cex="http://schemas.microsoft.com/office/word/2018/wordml/cex" xmlns:w16cid="http://schemas.microsoft.com/office/word/2016/wordml/cid" xmlns:w16="http://schemas.microsoft.com/office/word/2018/wordml" xmlns:w16du="http://schemas.microsoft.com/office/word/2023/wordml/word16du" xmlns:w16sdtdh="http://schemas.microsoft.com/office/word/2020/wordml/sdtdatahash" xmlns:w16se="http://schemas.microsoft.com/office/word/2015/wordml/symex" xmlns:wpg="http://schemas.microsoft.com/office/word/2010/wordprocessingGroup" xmlns:wpi="http://schemas.microsoft.com/office/word/2010/wordprocessingInk" xmlns:wne="http://schemas.microsoft.com/office/word/2006/wordml" xmlns:wps="http://schemas.microsoft.com/office/word/2010/wordprocessingShape" mc:Ignorable="w14 w15 w16se w16cid w16 w16cex w16sdtdh w16du wp14">
+  <w15:person w15:author="Pamela Jebson">
+    <w15:presenceInfo w15:providerId="Windows Live" w15:userId="be926e77587a5505"/>
+  </w15:person>
+</w15:people>
 </file>
 
 <file path=word/styles.xml><?xml version="1.0" encoding="utf-8"?>
@@ -734,6 +833,74 @@
       <w:szCs w:val="24"/>
     </w:rPr>
   </w:style>
+  <w:style w:type="character" w:styleId="CommentReference">
+    <w:name w:val="annotation reference"/>
+    <w:basedOn w:val="DefaultParagraphFont"/>
+    <w:uiPriority w:val="99"/>
+    <w:semiHidden/>
+    <w:unhideWhenUsed/>
+    <w:rsid w:val="008A1740"/>
+    <w:rPr>
+      <w:sz w:val="16"/>
+      <w:szCs w:val="16"/>
+    </w:rPr>
+  </w:style>
+  <w:style w:type="paragraph" w:styleId="CommentText">
+    <w:name w:val="annotation text"/>
+    <w:basedOn w:val="Normal"/>
+    <w:link w:val="CommentTextChar"/>
+    <w:uiPriority w:val="99"/>
+    <w:semiHidden/>
+    <w:unhideWhenUsed/>
+    <w:rsid w:val="008A1740"/>
+    <w:pPr>
+      <w:spacing w:line="240" w:lineRule="auto"/>
+    </w:pPr>
+    <w:rPr>
+      <w:sz w:val="20"/>
+      <w:szCs w:val="20"/>
+    </w:rPr>
+  </w:style>
+  <w:style w:type="character" w:customStyle="1" w:styleId="CommentTextChar">
+    <w:name w:val="Comment Text Char"/>
+    <w:basedOn w:val="DefaultParagraphFont"/>
+    <w:link w:val="CommentText"/>
+    <w:uiPriority w:val="99"/>
+    <w:semiHidden/>
+    <w:rsid w:val="008A1740"/>
+    <w:rPr>
+      <w:sz w:val="20"/>
+      <w:szCs w:val="20"/>
+    </w:rPr>
+  </w:style>
+  <w:style w:type="paragraph" w:styleId="CommentSubject">
+    <w:name w:val="annotation subject"/>
+    <w:basedOn w:val="CommentText"/>
+    <w:next w:val="CommentText"/>
+    <w:link w:val="CommentSubjectChar"/>
+    <w:uiPriority w:val="99"/>
+    <w:semiHidden/>
+    <w:unhideWhenUsed/>
+    <w:rsid w:val="008A1740"/>
+    <w:rPr>
+      <w:b/>
+      <w:bCs/>
+    </w:rPr>
+  </w:style>
+  <w:style w:type="character" w:customStyle="1" w:styleId="CommentSubjectChar">
+    <w:name w:val="Comment Subject Char"/>
+    <w:basedOn w:val="CommentTextChar"/>
+    <w:link w:val="CommentSubject"/>
+    <w:uiPriority w:val="99"/>
+    <w:semiHidden/>
+    <w:rsid w:val="008A1740"/>
+    <w:rPr>
+      <w:b/>
+      <w:bCs/>
+      <w:sz w:val="20"/>
+      <w:szCs w:val="20"/>
+    </w:rPr>
+  </w:style>
 </w:styles>
 </file>
 
@@ -1030,4 +1197,16 @@
     </a:ext>
   </a:extLst>
 </a:theme>
+</file>
+
+<file path=customXml/item1.xml><?xml version="1.0" encoding="utf-8"?>
+<b:Sources xmlns:b="http://schemas.openxmlformats.org/officeDocument/2006/bibliography" xmlns="http://schemas.openxmlformats.org/officeDocument/2006/bibliography" SelectedStyle="\APASixthEditionOfficeOnline.xsl" StyleName="APA" Version="6"/>
+</file>
+
+<file path=customXml/itemProps1.xml><?xml version="1.0" encoding="utf-8"?>
+<ds:datastoreItem xmlns:ds="http://schemas.openxmlformats.org/officeDocument/2006/customXml" ds:itemID="{175C7929-E5F5-48F3-89F7-CB3D2E6837D6}">
+  <ds:schemaRefs>
+    <ds:schemaRef ds:uri="http://schemas.openxmlformats.org/officeDocument/2006/bibliography"/>
+  </ds:schemaRefs>
+</ds:datastoreItem>
 </file>
</xml_diff>

<commit_message>
added testing table and planned
</commit_message>
<xml_diff>
--- a/Academic Report - Thomas JEBSON - 24804704.docx
+++ b/Academic Report - Thomas JEBSON - 24804704.docx
@@ -47,7 +47,13 @@
         <w:commentReference w:id="0"/>
       </w:r>
       <w:r>
-        <w:t>. The objective of this game is to arrange balls of the same colour into groups of at least three, as this causes the whole arrangement to pop. Any unsupported balls fall to the bottom of the screen and are also destroyed. The aim of the game is to pop all of the balls in the scene before they reach the bottom of the screen. This downward motion starts as soon as the level begins.</w:t>
+        <w:t xml:space="preserve">. The objective of this game is to arrange balls of the same colour into groups of at least three, as this causes the whole arrangement to pop. Any unsupported balls fall to the bottom of the screen and are also destroyed. </w:t>
+      </w:r>
+      <w:r>
+        <w:t>The game aim is</w:t>
+      </w:r>
+      <w:r>
+        <w:t xml:space="preserve"> to pop all of the balls in the scene before they reach the bottom of the screen. This downward motion starts as soon as the level begins.</w:t>
       </w:r>
     </w:p>
     <w:p>
@@ -60,7 +66,7 @@
     </w:p>
     <w:p>
       <w:r>
-        <w:t xml:space="preserve">In this game, you control a cannon which is angled towards your mouse cursor. When you press the </w:t>
+        <w:t xml:space="preserve">In this game, you control a cannon angled towards your mouse cursor. When you press the </w:t>
       </w:r>
       <w:r>
         <w:t>left mouse button,</w:t>
@@ -98,7 +104,19 @@
     <w:p/>
     <w:p>
       <w:r>
-        <w:t>From the moment the level begins, the ceiling begins to move down towards the bottom of the level with uniform velocity. However, should any of the balls trapped beneath the ceiling reach the bottom of the game scene first, the game is over, and the player has lost. The aim of the game is to pop all the balls in the scene before this occurs.</w:t>
+        <w:t xml:space="preserve">From the moment the level begins, the ceiling </w:t>
+      </w:r>
+      <w:r>
+        <w:t>starts</w:t>
+      </w:r>
+      <w:r>
+        <w:t xml:space="preserve"> to move down towards the bottom of the level with uniform velocity. However, should any of the balls trapped beneath the ceiling reach the bottom of the game scene first, the game is over, and the player has lost. </w:t>
+      </w:r>
+      <w:r>
+        <w:t>The game aim is</w:t>
+      </w:r>
+      <w:r>
+        <w:t xml:space="preserve"> to pop all the balls in the scene before this occurs.</w:t>
       </w:r>
     </w:p>
     <w:p>
@@ -135,11 +153,315 @@
         <w:t>Game Testing</w:t>
       </w:r>
     </w:p>
-    <w:p>
-      <w:r>
-        <w:t>Pass</w:t>
-      </w:r>
-    </w:p>
+    <w:tbl>
+      <w:tblPr>
+        <w:tblStyle w:val="TableGrid"/>
+        <w:tblW w:w="0" w:type="auto"/>
+        <w:tblLook w:val="04A0" w:firstRow="1" w:lastRow="0" w:firstColumn="1" w:lastColumn="0" w:noHBand="0" w:noVBand="1"/>
+      </w:tblPr>
+      <w:tblGrid>
+        <w:gridCol w:w="1502"/>
+        <w:gridCol w:w="1502"/>
+        <w:gridCol w:w="1503"/>
+        <w:gridCol w:w="1503"/>
+        <w:gridCol w:w="1503"/>
+        <w:gridCol w:w="1503"/>
+      </w:tblGrid>
+      <w:tr>
+        <w:tc>
+          <w:tcPr>
+            <w:tcW w:w="1502" w:type="dxa"/>
+          </w:tcPr>
+          <w:p>
+            <w:r>
+              <w:t>Test Number</w:t>
+            </w:r>
+          </w:p>
+        </w:tc>
+        <w:tc>
+          <w:tcPr>
+            <w:tcW w:w="1502" w:type="dxa"/>
+          </w:tcPr>
+          <w:p>
+            <w:r>
+              <w:t>Test Details</w:t>
+            </w:r>
+          </w:p>
+        </w:tc>
+        <w:tc>
+          <w:tcPr>
+            <w:tcW w:w="1503" w:type="dxa"/>
+          </w:tcPr>
+          <w:p>
+            <w:r>
+              <w:t>Test Type</w:t>
+            </w:r>
+          </w:p>
+        </w:tc>
+        <w:tc>
+          <w:tcPr>
+            <w:tcW w:w="1503" w:type="dxa"/>
+          </w:tcPr>
+          <w:p>
+            <w:r>
+              <w:t>Expected Result</w:t>
+            </w:r>
+          </w:p>
+        </w:tc>
+        <w:tc>
+          <w:tcPr>
+            <w:tcW w:w="1503" w:type="dxa"/>
+          </w:tcPr>
+          <w:p>
+            <w:r>
+              <w:t>Actual Result</w:t>
+            </w:r>
+          </w:p>
+        </w:tc>
+        <w:tc>
+          <w:tcPr>
+            <w:tcW w:w="1503" w:type="dxa"/>
+          </w:tcPr>
+          <w:p>
+            <w:r>
+              <w:t>Solution</w:t>
+            </w:r>
+          </w:p>
+        </w:tc>
+      </w:tr>
+      <w:tr>
+        <w:tc>
+          <w:tcPr>
+            <w:tcW w:w="1502" w:type="dxa"/>
+          </w:tcPr>
+          <w:p>
+            <w:r>
+              <w:t>1</w:t>
+            </w:r>
+          </w:p>
+        </w:tc>
+        <w:tc>
+          <w:tcPr>
+            <w:tcW w:w="1502" w:type="dxa"/>
+          </w:tcPr>
+          <w:p>
+            <w:r>
+              <w:t>Test transition between levels</w:t>
+            </w:r>
+          </w:p>
+        </w:tc>
+        <w:tc>
+          <w:tcPr>
+            <w:tcW w:w="1503" w:type="dxa"/>
+          </w:tcPr>
+          <w:p/>
+        </w:tc>
+        <w:tc>
+          <w:tcPr>
+            <w:tcW w:w="1503" w:type="dxa"/>
+          </w:tcPr>
+          <w:p/>
+        </w:tc>
+        <w:tc>
+          <w:tcPr>
+            <w:tcW w:w="1503" w:type="dxa"/>
+          </w:tcPr>
+          <w:p/>
+        </w:tc>
+        <w:tc>
+          <w:tcPr>
+            <w:tcW w:w="1503" w:type="dxa"/>
+          </w:tcPr>
+          <w:p/>
+        </w:tc>
+      </w:tr>
+      <w:tr>
+        <w:tc>
+          <w:tcPr>
+            <w:tcW w:w="1502" w:type="dxa"/>
+          </w:tcPr>
+          <w:p>
+            <w:r>
+              <w:t>2</w:t>
+            </w:r>
+          </w:p>
+        </w:tc>
+        <w:tc>
+          <w:tcPr>
+            <w:tcW w:w="1502" w:type="dxa"/>
+          </w:tcPr>
+          <w:p>
+            <w:r>
+              <w:t>Test cannon ball switch (observed as bug)</w:t>
+            </w:r>
+          </w:p>
+        </w:tc>
+        <w:tc>
+          <w:tcPr>
+            <w:tcW w:w="1503" w:type="dxa"/>
+          </w:tcPr>
+          <w:p/>
+        </w:tc>
+        <w:tc>
+          <w:tcPr>
+            <w:tcW w:w="1503" w:type="dxa"/>
+          </w:tcPr>
+          <w:p/>
+        </w:tc>
+        <w:tc>
+          <w:tcPr>
+            <w:tcW w:w="1503" w:type="dxa"/>
+          </w:tcPr>
+          <w:p/>
+        </w:tc>
+        <w:tc>
+          <w:tcPr>
+            <w:tcW w:w="1503" w:type="dxa"/>
+          </w:tcPr>
+          <w:p/>
+        </w:tc>
+      </w:tr>
+      <w:tr>
+        <w:tc>
+          <w:tcPr>
+            <w:tcW w:w="1502" w:type="dxa"/>
+          </w:tcPr>
+          <w:p>
+            <w:r>
+              <w:t>3</w:t>
+            </w:r>
+          </w:p>
+        </w:tc>
+        <w:tc>
+          <w:tcPr>
+            <w:tcW w:w="1502" w:type="dxa"/>
+          </w:tcPr>
+          <w:p>
+            <w:r>
+              <w:t>Test anvil fall on fail</w:t>
+            </w:r>
+          </w:p>
+        </w:tc>
+        <w:tc>
+          <w:tcPr>
+            <w:tcW w:w="1503" w:type="dxa"/>
+          </w:tcPr>
+          <w:p/>
+        </w:tc>
+        <w:tc>
+          <w:tcPr>
+            <w:tcW w:w="1503" w:type="dxa"/>
+          </w:tcPr>
+          <w:p/>
+        </w:tc>
+        <w:tc>
+          <w:tcPr>
+            <w:tcW w:w="1503" w:type="dxa"/>
+          </w:tcPr>
+          <w:p/>
+        </w:tc>
+        <w:tc>
+          <w:tcPr>
+            <w:tcW w:w="1503" w:type="dxa"/>
+          </w:tcPr>
+          <w:p/>
+        </w:tc>
+      </w:tr>
+      <w:tr>
+        <w:tc>
+          <w:tcPr>
+            <w:tcW w:w="1502" w:type="dxa"/>
+          </w:tcPr>
+          <w:p>
+            <w:r>
+              <w:lastRenderedPageBreak/>
+              <w:t>4</w:t>
+            </w:r>
+          </w:p>
+        </w:tc>
+        <w:tc>
+          <w:tcPr>
+            <w:tcW w:w="1502" w:type="dxa"/>
+          </w:tcPr>
+          <w:p>
+            <w:r>
+              <w:t>Test scoring system (observed as bug)</w:t>
+            </w:r>
+          </w:p>
+        </w:tc>
+        <w:tc>
+          <w:tcPr>
+            <w:tcW w:w="1503" w:type="dxa"/>
+          </w:tcPr>
+          <w:p/>
+        </w:tc>
+        <w:tc>
+          <w:tcPr>
+            <w:tcW w:w="1503" w:type="dxa"/>
+          </w:tcPr>
+          <w:p/>
+        </w:tc>
+        <w:tc>
+          <w:tcPr>
+            <w:tcW w:w="1503" w:type="dxa"/>
+          </w:tcPr>
+          <w:p/>
+        </w:tc>
+        <w:tc>
+          <w:tcPr>
+            <w:tcW w:w="1503" w:type="dxa"/>
+          </w:tcPr>
+          <w:p/>
+        </w:tc>
+      </w:tr>
+      <w:tr>
+        <w:tc>
+          <w:tcPr>
+            <w:tcW w:w="1502" w:type="dxa"/>
+          </w:tcPr>
+          <w:p>
+            <w:r>
+              <w:t>5</w:t>
+            </w:r>
+          </w:p>
+        </w:tc>
+        <w:tc>
+          <w:tcPr>
+            <w:tcW w:w="1502" w:type="dxa"/>
+          </w:tcPr>
+          <w:p>
+            <w:r>
+              <w:t>Test ball fired from cannon</w:t>
+            </w:r>
+          </w:p>
+        </w:tc>
+        <w:tc>
+          <w:tcPr>
+            <w:tcW w:w="1503" w:type="dxa"/>
+          </w:tcPr>
+          <w:p/>
+        </w:tc>
+        <w:tc>
+          <w:tcPr>
+            <w:tcW w:w="1503" w:type="dxa"/>
+          </w:tcPr>
+          <w:p/>
+        </w:tc>
+        <w:tc>
+          <w:tcPr>
+            <w:tcW w:w="1503" w:type="dxa"/>
+          </w:tcPr>
+          <w:p/>
+        </w:tc>
+        <w:tc>
+          <w:tcPr>
+            <w:tcW w:w="1503" w:type="dxa"/>
+          </w:tcPr>
+          <w:p/>
+        </w:tc>
+      </w:tr>
+    </w:tbl>
+    <w:p/>
     <w:p>
       <w:pPr>
         <w:pStyle w:val="Heading3"/>
@@ -901,6 +1223,25 @@
       <w:szCs w:val="20"/>
     </w:rPr>
   </w:style>
+  <w:style w:type="table" w:styleId="TableGrid">
+    <w:name w:val="Table Grid"/>
+    <w:basedOn w:val="TableNormal"/>
+    <w:uiPriority w:val="39"/>
+    <w:rsid w:val="00B71382"/>
+    <w:pPr>
+      <w:spacing w:after="0" w:line="240" w:lineRule="auto"/>
+    </w:pPr>
+    <w:tblPr>
+      <w:tblBorders>
+        <w:top w:val="single" w:sz="4" w:space="0" w:color="auto"/>
+        <w:left w:val="single" w:sz="4" w:space="0" w:color="auto"/>
+        <w:bottom w:val="single" w:sz="4" w:space="0" w:color="auto"/>
+        <w:right w:val="single" w:sz="4" w:space="0" w:color="auto"/>
+        <w:insideH w:val="single" w:sz="4" w:space="0" w:color="auto"/>
+        <w:insideV w:val="single" w:sz="4" w:space="0" w:color="auto"/>
+      </w:tblBorders>
+    </w:tblPr>
+  </w:style>
 </w:styles>
 </file>
 

</xml_diff>

<commit_message>
Update Academic Report - Thomas JEBSON - 24804704.docx
</commit_message>
<xml_diff>
--- a/Academic Report - Thomas JEBSON - 24804704.docx
+++ b/Academic Report - Thomas JEBSON - 24804704.docx
@@ -50,7 +50,13 @@
         <w:t xml:space="preserve">. The objective of this game is to arrange balls of the same colour into groups of at least three, as this causes the whole arrangement to pop. Any unsupported balls fall to the bottom of the screen and are also destroyed. </w:t>
       </w:r>
       <w:r>
-        <w:t>The game aim is</w:t>
+        <w:t xml:space="preserve">The </w:t>
+      </w:r>
+      <w:r>
+        <w:t>game's</w:t>
+      </w:r>
+      <w:r>
+        <w:t xml:space="preserve"> aim is</w:t>
       </w:r>
       <w:r>
         <w:t xml:space="preserve"> to pop all of the balls in the scene before they reach the bottom of the screen. This downward motion starts as soon as the level begins.</w:t>
@@ -66,28 +72,10 @@
     </w:p>
     <w:p>
       <w:r>
-        <w:t>The player controls a cannon angled at the mouse cursor in this game</w:t>
-      </w:r>
-      <w:r>
-        <w:t xml:space="preserve">. When </w:t>
-      </w:r>
-      <w:r>
-        <w:t>the left mouse button is pressed</w:t>
-      </w:r>
-      <w:r>
-        <w:t>,</w:t>
-      </w:r>
-      <w:r>
-        <w:t xml:space="preserve"> it causes the cannon to fire the </w:t>
-      </w:r>
-      <w:r>
-        <w:t>loaded ball</w:t>
-      </w:r>
-      <w:r>
-        <w:t xml:space="preserve">. </w:t>
-      </w:r>
-      <w:r>
-        <w:t>The cannon displays the current and the next ball to be fired</w:t>
+        <w:t>In this game, the player controls a cannon angled at the mouse cursor. When the left mouse button is pressed, the cannon fires the loaded ball. The cannon displays the current and the next balls</w:t>
+      </w:r>
+      <w:r>
+        <w:t xml:space="preserve"> to be fired</w:t>
       </w:r>
       <w:r>
         <w:t>. Balls are added to this queue at random. When the ball is fired, it moves in the direction the cannon was pointing with uniform velocity but will bounce off the side walls of the game scene.</w:t>
@@ -110,7 +98,7 @@
         <w:t xml:space="preserve">Once the balls have been stuck together, </w:t>
       </w:r>
       <w:r>
-        <w:t>the game checks for a grouping of 3 or more balls and pops groups if this condition is met. It is important to note that this condition isn’t checked when the balls are initially placed in the scene.</w:t>
+        <w:t>the game checks for a grouping of 3 or more balls and pops groups if this condition is met. It is important to note that this condition isn’t checked when the balls are placed in the scene.</w:t>
       </w:r>
     </w:p>
     <w:p/>
@@ -122,7 +110,7 @@
         <w:t>starts</w:t>
       </w:r>
       <w:r>
-        <w:t xml:space="preserve"> to move down towards the bottom of the level with uniform velocity. However, should any of the balls trapped beneath the ceiling reach the bottom of the game scene first, the game is over, and the player has lost. </w:t>
+        <w:t xml:space="preserve"> to move down towards the bottom of the level with uniform velocity. However, should any balls trapped beneath the ceiling reach the bottom of the game scene first, the game is over, and the player has lost. </w:t>
       </w:r>
       <w:r>
         <w:t xml:space="preserve">The </w:t>
@@ -394,7 +382,7 @@
           </w:tcPr>
           <w:p>
             <w:r>
-              <w:t>After the cannon is loaded up with a second ball (placing it as the next ball to be fired), it must be swapped with the ball that’s supposed to fire first.</w:t>
+              <w:t>After the cannon is loaded with a second ball (placing it as the next ball to be fired), it must be swapped with the ball that’s supposed to fire first.</w:t>
             </w:r>
           </w:p>
         </w:tc>
@@ -406,38 +394,41 @@
           </w:tcPr>
           <w:p>
             <w:r>
+              <w:t>3</w:t>
+            </w:r>
+          </w:p>
+        </w:tc>
+        <w:tc>
+          <w:tcPr>
+            <w:tcW w:w="1439" w:type="dxa"/>
+          </w:tcPr>
+          <w:p>
+            <w:r>
+              <w:t>Test anvil fall on fail</w:t>
+            </w:r>
+          </w:p>
+        </w:tc>
+        <w:tc>
+          <w:tcPr>
+            <w:tcW w:w="1376" w:type="dxa"/>
+          </w:tcPr>
+          <w:p>
+            <w:r>
+              <w:t>Functionality testing</w:t>
+            </w:r>
+          </w:p>
+        </w:tc>
+        <w:tc>
+          <w:tcPr>
+            <w:tcW w:w="2045" w:type="dxa"/>
+          </w:tcPr>
+          <w:p>
+            <w:r>
+              <w:t xml:space="preserve">When the balls meet the cannon at </w:t>
+            </w:r>
+            <w:r>
               <w:lastRenderedPageBreak/>
-              <w:t>3</w:t>
-            </w:r>
-          </w:p>
-        </w:tc>
-        <w:tc>
-          <w:tcPr>
-            <w:tcW w:w="1439" w:type="dxa"/>
-          </w:tcPr>
-          <w:p>
-            <w:r>
-              <w:t>Test anvil fall on fail</w:t>
-            </w:r>
-          </w:p>
-        </w:tc>
-        <w:tc>
-          <w:tcPr>
-            <w:tcW w:w="1376" w:type="dxa"/>
-          </w:tcPr>
-          <w:p>
-            <w:r>
-              <w:t>Functionality testing</w:t>
-            </w:r>
-          </w:p>
-        </w:tc>
-        <w:tc>
-          <w:tcPr>
-            <w:tcW w:w="2045" w:type="dxa"/>
-          </w:tcPr>
-          <w:p>
-            <w:r>
-              <w:t>When the balls meet the cannon at the bottom of the screen, the anvil should fall, marking the end of the level.</w:t>
+              <w:t>the bottom of the screen, the anvil should fall, marking the end of the level.</w:t>
             </w:r>
           </w:p>
         </w:tc>
@@ -447,6 +438,7 @@
           </w:tcPr>
           <w:p>
             <w:r>
+              <w:lastRenderedPageBreak/>
               <w:t>The expected result was observed.</w:t>
             </w:r>
           </w:p>
@@ -479,7 +471,7 @@
           </w:tcPr>
           <w:p>
             <w:r>
-              <w:t>Test scoring system (observed as bug)</w:t>
+              <w:t>Test scoring system</w:t>
             </w:r>
           </w:p>
         </w:tc>
@@ -499,7 +491,7 @@
           </w:tcPr>
           <w:p>
             <w:r>
-              <w:t>f</w:t>
+              <w:t>Any ball removed from the level after falling to the bottom of the screen should increase the score by 50 points.</w:t>
             </w:r>
           </w:p>
         </w:tc>
@@ -507,13 +499,24 @@
           <w:tcPr>
             <w:tcW w:w="2268" w:type="dxa"/>
           </w:tcPr>
-          <w:p/>
+          <w:p>
+            <w:r>
+              <w:t>When removed from the scene, any ball increases the score by 50 points, regardless of whether</w:t>
+            </w:r>
+            <w:r>
+              <w:t xml:space="preserve"> it fell or was destroyed as a group of three.</w:t>
+            </w:r>
+          </w:p>
         </w:tc>
         <w:tc>
           <w:tcPr>
             <w:tcW w:w="2693" w:type="dxa"/>
           </w:tcPr>
-          <w:p/>
+          <w:p>
+            <w:r>
+              <w:t>Move the 50-point bonus from where the balls are destroyed to when the balls are marked with the ‘falling’ flag, but this should only occur when the flag changes, as opposed to every frame with the flag set to ‘true’.</w:t>
+            </w:r>
+          </w:p>
         </w:tc>
       </w:tr>
       <w:tr>
@@ -541,7 +544,11 @@
           <w:tcPr>
             <w:tcW w:w="1376" w:type="dxa"/>
           </w:tcPr>
-          <w:p/>
+          <w:p>
+            <w:r>
+              <w:t>Functionality testing</w:t>
+            </w:r>
+          </w:p>
         </w:tc>
         <w:tc>
           <w:tcPr>
@@ -549,7 +556,7 @@
           </w:tcPr>
           <w:p>
             <w:r>
-              <w:t>p</w:t>
+              <w:t>Any ball fired from the cannon will have an angle identical to the direction the cannon was pointing when fired.</w:t>
             </w:r>
           </w:p>
         </w:tc>
@@ -557,13 +564,21 @@
           <w:tcPr>
             <w:tcW w:w="2268" w:type="dxa"/>
           </w:tcPr>
-          <w:p/>
+          <w:p>
+            <w:r>
+              <w:t>The expected result was observed.</w:t>
+            </w:r>
+          </w:p>
         </w:tc>
         <w:tc>
           <w:tcPr>
             <w:tcW w:w="2693" w:type="dxa"/>
           </w:tcPr>
-          <w:p/>
+          <w:p>
+            <w:r>
+              <w:t>No changes were necessary.</w:t>
+            </w:r>
+          </w:p>
         </w:tc>
       </w:tr>
     </w:tbl>
@@ -651,13 +666,8 @@
       </w:r>
     </w:p>
     <w:p>
-      <w:proofErr w:type="spellStart"/>
-      <w:r>
-        <w:t>Montoreano</w:t>
-      </w:r>
-      <w:proofErr w:type="spellEnd"/>
-      <w:r>
-        <w:t xml:space="preserve">. J - </w:t>
+      <w:r>
+        <w:t xml:space="preserve">Montoreano. J - </w:t>
       </w:r>
       <w:hyperlink r:id="rId12" w:history="1">
         <w:r>
@@ -688,13 +698,8 @@
       </w:r>
     </w:p>
     <w:p>
-      <w:proofErr w:type="spellStart"/>
-      <w:r>
-        <w:t>Lubos</w:t>
-      </w:r>
-      <w:proofErr w:type="spellEnd"/>
-      <w:r>
-        <w:t xml:space="preserve">. L - </w:t>
+      <w:r>
+        <w:t xml:space="preserve">Lubos. L - </w:t>
       </w:r>
       <w:hyperlink r:id="rId14" w:history="1">
         <w:r>

</xml_diff>